<commit_message>
Visium HD release 2026-10-28: recopy docs (check_reference note)
Co-Authored-By: Claude Opus 5.5 <noreply@anthropic.com>
</commit_message>
<xml_diff>
--- a/release/CLOSHA3/Spatial_Transcriptomics_Visium_HD_Pipeline/2026-10-28/docs/pipeline/Portal_Content.docx
+++ b/release/CLOSHA3/Spatial_Transcriptomics_Visium_HD_Pipeline/2026-10-28/docs/pipeline/Portal_Content.docx
@@ -2082,7 +2082,7 @@
         <w:t xml:space="preserve">group_by=rctd_first_type</w:t>
       </w:r>
       <w:r>
-        <w:t xml:space="preserve">) 조건을 비교합니다. 참조를 주지 않으면 이 두 단계는 건너뛰고 나머지 분석은 그대로 끝나며, 군집은 마커 유전자와 조직 위치로 해석합니다. 공개 단일세포 아틀라스(예: CELLxGENE, Allen Brain Cell Atlas)를 참조로 쓸 수 있습니다. 열 이름을 모르면 비워 두고 실행하면 분석 전에 멈추고 오류 로그에 후보 열을 보여 줍니다.</w:t>
+        <w:t xml:space="preserve">) 조건을 비교합니다. 참조를 주지 않으면 이 두 단계는 건너뛰고 나머지 분석은 그대로 끝나며, 군집은 마커 유전자와 조직 위치로 해석합니다. 공개 단일세포 아틀라스(예: CELLxGENE, Allen Brain Cell Atlas)를 참조로 쓸 수 있습니다. 열 이름을 모르면 파이프라인을 돌리기 전에 check_reference 모듈에 참조 자료만 넣어 실행해 후보 열을 확인해 주세요. 파이프라인 안에서는 spatial_hd_rctd가 앞 단계(정규화, 군집)가 끝난 뒤에 실행되므로, 열 이름을 비워 두면 그때 멈추고 오류 로그에 후보 열을 보여 줍니다.</w:t>
       </w:r>
     </w:p>
     <w:p>
@@ -2284,7 +2284,7 @@
         <w:t xml:space="preserve">group_by=rctd_first_type</w:t>
       </w:r>
       <w:r>
-        <w:t xml:space="preserve">). Without a reference these two steps are skipped and the rest of the analysis finishes as usual; clusters are then interpreted by their marker genes and tissue location. Public single-cell atlases (for example CELLxGENE, Allen Brain Cell Atlas) can serve as references. If the column name is unknown, leave it empty: the run stops before the analysis and the error log lists the candidate columns.</w:t>
+        <w:t xml:space="preserve">). Without a reference these two steps are skipped and the rest of the analysis finishes as usual; clusters are then interpreted by their marker genes and tissue location. Public single-cell atlases (for example CELLxGENE, Allen Brain Cell Atlas) can serve as references. If the column name is unknown, run the check_reference module with the reference alone before the pipeline to see the candidate columns. In the pipeline spatial_hd_rctd runs after the earlier steps (normalisation, clustering), so with the column left empty the run stops only then, listing the candidate columns in the error log.</w:t>
       </w:r>
     </w:p>
     <w:p>

</xml_diff>

<commit_message>
Visium HD release 2026-10-28: recopy docs and map (check_reference pre-check)
Co-Authored-By: Claude Opus 5.5 <noreply@anthropic.com>
</commit_message>
<xml_diff>
--- a/release/CLOSHA3/Spatial_Transcriptomics_Visium_HD_Pipeline/2026-10-28/docs/pipeline/Portal_Content.docx
+++ b/release/CLOSHA3/Spatial_Transcriptomics_Visium_HD_Pipeline/2026-10-28/docs/pipeline/Portal_Content.docx
@@ -1176,7 +1176,7 @@
         <w:spacing w:after="80"/>
       </w:pPr>
       <w:r>
-        <w:t xml:space="preserve">국문: Visium HD 공간 전사체 파이프라인 흐름도. bin 불러오기·정규화·sketch(spatial_hd_prep), 슬라이드 통합 군집과 모든 bin 배정(spatial_hd_cluster) 뒤 조건 간 비교(spatial_condition_de), 공간 가변 유전자(spatial_hd_svf), 단일세포 참조로 모든 bin에 세포 유형을 붙이는 분석(spatial_hd_rctd)으로 갈라지고, 세포 유형 결과가 세포 유형별 조건 간 비교(spatial_condition_de)로 이어짐. 세포 유형 분석은 참조를 줄 때만 실행됨.</w:t>
+        <w:t xml:space="preserve">국문: Visium HD 공간 전사체 파이프라인 흐름도. bin 불러오기·정규화·sketch(spatial_hd_prep), 슬라이드 통합 군집과 모든 bin 배정(spatial_hd_cluster) 뒤 조건 간 비교(spatial_condition_de), 공간 가변 유전자(spatial_hd_svf), 단일세포 참조로 모든 bin에 세포 유형을 붙이는 분석(spatial_hd_rctd)으로 갈라지고, 세포 유형 결과가 세포 유형별 조건 간 비교(spatial_condition_de)로 이어짐. 세포 유형 분석은 참조를 줄 때만 실행됨. 참조의 세포 유형 열 이름은 파이프라인 밖의 check_reference(점선)로 미리 확인할 수 있음.</w:t>
       </w:r>
     </w:p>
     <w:p>
@@ -1189,7 +1189,7 @@
         <w:spacing w:after="80"/>
       </w:pPr>
       <w:r>
-        <w:t xml:space="preserve">English: Visium HD spatial transcriptomics workflow: bin loading, normalisation and sketching (spatial_hd_prep), joint clustering of slides with labels for every bin (spatial_hd_cluster), then condition comparison (spatial_condition_de), spatially variable genes (spatial_hd_svf), and cell types for every bin from a single-cell reference (spatial_hd_rctd) followed by condition comparison per cell type (spatial_condition_de); the cell-type branch runs only when a reference is given.</w:t>
+        <w:t xml:space="preserve">English: Visium HD spatial transcriptomics workflow: bin loading, normalisation and sketching (spatial_hd_prep), joint clustering of slides with labels for every bin (spatial_hd_cluster), then condition comparison (spatial_condition_de), spatially variable genes (spatial_hd_svf), and cell types for every bin from a single-cell reference (spatial_hd_rctd) followed by condition comparison per cell type (spatial_condition_de); the cell-type branch runs only when a reference is given. The cell-type column of the reference can be checked beforehand with check_reference, outside the pipeline (dashed).</w:t>
       </w:r>
     </w:p>
     <w:p>

</xml_diff>